<commit_message>
fix: remove duplicated 'from public documents' in abstract/contributions
The replace_all for 'irreducibly opaque' created duplications where the
original text already had 'from public documents' after it. Also softened
'genuine judicial opacity' to 'judicial opacity' in abstract.
Regenerated PDF and DOCX.

Co-Authored-By: Claude Opus 4.6 (1M context) <noreply@anthropic.com>
</commit_message>
<xml_diff>
--- a/reports/paper2_draft.docx
+++ b/reports/paper2_draft.docx
@@ -86,7 +86,7 @@
         <w:t xml:space="preserve"> </w:t>
       </w:r>
       <w:r>
-        <w:t xml:space="preserve">from any feature (R2=-0.01), indicating genuine judicial opacity: approximately 40% of sentencing variance reflects case-specific factors absent from published verdicts. Systematic experiments confirm that text mining (TF-IDF, transformer embeddings, domain keywords) cannot reliably improve prediction at this corpus size. Geographic variation is a composition effect (controlled p=0.20), while judge effects are significant (F=1.85, p=0.03) but not predictively useful. Indonesian corruption sentencing is partially predictable from prosecution demand and charge type, but judicial discretion remains opaque from public documents from public documents.</w:t>
+        <w:t xml:space="preserve">from any feature (R2=-0.01), indicating judicial opacity: approximately 40% of sentencing variance reflects case-specific factors absent from published verdicts. Systematic experiments confirm that text mining (TF-IDF, transformer embeddings, domain keywords) cannot reliably improve prediction at this corpus size. Geographic variation is a composition effect (controlled p=0.20), while judge effects are significant (F=1.85, p=0.03) but not predictively useful. Indonesian corruption sentencing is partially predictable from prosecution demand and charge type, but judicial discretion remains opaque from public documents.</w:t>
       </w:r>
     </w:p>
     <w:bookmarkEnd w:id="9"/>
@@ -292,7 +292,7 @@
         <w:t xml:space="preserve">Policy-relevant</w:t>
       </w:r>
       <w:r>
-        <w:t xml:space="preserve">: Demonstration that the sentencing discount is opaque from public documents from public court documents (R2=-0.01), with implications for sentencing consistency monitoring</w:t>
+        <w:t xml:space="preserve">: Demonstration that the sentencing discount is opaque from public court documents (R2=-0.01), with implications for sentencing consistency monitoring</w:t>
       </w:r>
     </w:p>
     <w:p>

</xml_diff>

<commit_message>
P2 AI&Law technical check: hapus ethics + funding statement dari naskah
Springer editorial support minta keduanya keluar dari badan naskah dan
diisikan di field submission system (jaga anonimitas double-anonymous).

Dihapus dari paper2_draft.docx + .md:
- Ethical Approval
- Informed Consent
- Statement Regarding Research Involving Human Participants and/or Animals
- Funding

Tetap: Author's Contribution, Competing Interests, Availability of Data
and Materials, Use of AI-Assisted Tools ("do not change anything else").

DOCX diedit di level OOXML (stdlib zipfile) — pandoc tidak tersedia di PC
rumah; zip valid, document.xml well-formed, 219 -> 215 paragraf.

Co-Authored-By: Claude Opus 5 (1M context) <noreply@anthropic.com>
</commit_message>
<xml_diff>
--- a/reports/paper2_draft.docx
+++ b/reports/paper2_draft.docx
@@ -3139,88 +3139,6 @@
       </w:pPr>
       <w:r>
         <w:t xml:space="preserve">Declarations</w:t>
-      </w:r>
-    </w:p>
-    <w:p>
-      <w:pPr>
-        <w:pStyle w:val="FirstParagraph"/>
-      </w:pPr>
-      <w:r>
-        <w:rPr>
-          <w:b/>
-          <w:bCs/>
-        </w:rPr>
-        <w:t xml:space="preserve">Ethical Approval.</w:t>
-      </w:r>
-      <w:r>
-        <w:t xml:space="preserve"> </w:t>
-      </w:r>
-      <w:r>
-        <w:t xml:space="preserve">Not applicable. This study analyzes publicly available court documents published by the Indonesian Supreme Court (</w:t>
-      </w:r>
-      <w:r>
-        <w:rPr>
-          <w:i/>
-          <w:iCs/>
-        </w:rPr>
-        <w:t xml:space="preserve">Mahkamah Agung</w:t>
-      </w:r>
-      <w:r>
-        <w:t xml:space="preserve">). No human subjects were involved and no ethics approval was required.</w:t>
-      </w:r>
-    </w:p>
-    <w:p>
-      <w:pPr>
-        <w:pStyle w:val="BodyText"/>
-      </w:pPr>
-      <w:r>
-        <w:rPr>
-          <w:b/>
-          <w:bCs/>
-        </w:rPr>
-        <w:t xml:space="preserve">Informed Consent.</w:t>
-      </w:r>
-      <w:r>
-        <w:t xml:space="preserve"> </w:t>
-      </w:r>
-      <w:r>
-        <w:t xml:space="preserve">Not applicable.</w:t>
-      </w:r>
-    </w:p>
-    <w:p>
-      <w:pPr>
-        <w:pStyle w:val="BodyText"/>
-      </w:pPr>
-      <w:r>
-        <w:rPr>
-          <w:b/>
-          <w:bCs/>
-        </w:rPr>
-        <w:t xml:space="preserve">Statement Regarding Research Involving Human Participants and/or Animals.</w:t>
-      </w:r>
-      <w:r>
-        <w:t xml:space="preserve"> </w:t>
-      </w:r>
-      <w:r>
-        <w:t xml:space="preserve">Not applicable. This research does not involve human participants or animals. All data consist of publicly available legal documents.</w:t>
-      </w:r>
-    </w:p>
-    <w:p>
-      <w:pPr>
-        <w:pStyle w:val="BodyText"/>
-      </w:pPr>
-      <w:r>
-        <w:rPr>
-          <w:b/>
-          <w:bCs/>
-        </w:rPr>
-        <w:t xml:space="preserve">Funding.</w:t>
-      </w:r>
-      <w:r>
-        <w:t xml:space="preserve"> </w:t>
-      </w:r>
-      <w:r>
-        <w:t xml:space="preserve">This research received no external funding.</w:t>
       </w:r>
     </w:p>
     <w:p>

</xml_diff>